<commit_message>
feat: Enhance contract handling and partner enrichment in document generation
- Added a new function to load current contracts linked to package lineage in `docx_service.py`.
- Updated report context to include a list of current contracts for better data handling in document generation.
- Incremented WORD_DEFAULT_MAPPINGS_VERSION to 15 to accommodate new mappings for current contracts.
- Enhanced partner lookup service to enrich contractor data with representative fields.
- Implemented logic to complete missing contractor fields during bid opening data processing.
- Updated tests to ensure new functionality works as expected, including contract context and partner enrichment.
- Created a new ADR to document the decision for enriching contractor representative fields from official sources.
</commit_message>
<xml_diff>
--- a/docs/BiddingFlow_Mau_Kiem_Thu_Xuat_Word.docx
+++ b/docs/BiddingFlow_Mau_Kiem_Thu_Xuat_Word.docx
@@ -4058,7 +4058,7 @@
                 <w:color w:val="5B6573"/>
                 <w:sz w:val="19"/>
               </w:rPr>
-              <w:t>Mỗi lượt xuất hiện nạp một hợp đồng liên kết với gói thầu. Hãy dùng cùng mẫu cho hai lượt: lượt 1 với phân loại Tư vấn, lượt 2 với phân loại Thẩm định; đối chiếu trường Phân loại hợp đồng.</w:t>
+              <w:t>Mỗi hợp đồng hiện hành liên kết với gói thầu được xuất thành một bảng bên dưới. Đối chiếu đủ phân loại Tư vấn và Thẩm định.</w:t>
             </w:r>
           </w:p>
         </w:tc>
@@ -4068,6 +4068,13 @@
       <w:pPr>
         <w:spacing w:before="0" w:after="120" w:line="120" w:lineRule="auto"/>
       </w:pPr>
+      <w:r>
+        <w:rPr>
+          <w:vanish/>
+          <w:sz w:val="2"/>
+        </w:rPr>
+        <w:t>{#ds_hop_dong}</w:t>
+      </w:r>
     </w:p>
     <w:tbl>
       <w:tblPr>
@@ -4150,7 +4157,7 @@
                 <w:color w:val="000000"/>
                 <w:sz w:val="20"/>
               </w:rPr>
-              <w:t>{hd_phan_loai}</w:t>
+              <w:t>{phan_loai}</w:t>
             </w:r>
           </w:p>
         </w:tc>
@@ -4216,7 +4223,7 @@
                 <w:color w:val="000000"/>
                 <w:sz w:val="20"/>
               </w:rPr>
-              <w:t>{ten_hd}</w:t>
+              <w:t>{ten_hop_dong}</w:t>
             </w:r>
           </w:p>
         </w:tc>
@@ -4282,7 +4289,7 @@
                 <w:color w:val="000000"/>
                 <w:sz w:val="20"/>
               </w:rPr>
-              <w:t>{so_hd}</w:t>
+              <w:t>{so_hop_dong}</w:t>
             </w:r>
           </w:p>
         </w:tc>
@@ -4348,7 +4355,7 @@
                 <w:color w:val="000000"/>
                 <w:sz w:val="20"/>
               </w:rPr>
-              <w:t>{ngay_ky_hd}</w:t>
+              <w:t>{ngay_ky}</w:t>
             </w:r>
           </w:p>
         </w:tc>
@@ -4414,7 +4421,7 @@
                 <w:color w:val="000000"/>
                 <w:sz w:val="20"/>
               </w:rPr>
-              <w:t>{hd_gia_tri}</w:t>
+              <w:t>{gia_tri}</w:t>
             </w:r>
           </w:p>
         </w:tc>
@@ -4480,7 +4487,7 @@
                 <w:color w:val="000000"/>
                 <w:sz w:val="20"/>
               </w:rPr>
-              <w:t>{loai_hd}</w:t>
+              <w:t>{loai_hop_dong}</w:t>
             </w:r>
           </w:p>
         </w:tc>
@@ -4546,7 +4553,7 @@
                 <w:color w:val="000000"/>
                 <w:sz w:val="20"/>
               </w:rPr>
-              <w:t>{tg_thuc_hien_hd}</w:t>
+              <w:t>{thoi_gian_thuc_hien}</w:t>
             </w:r>
           </w:p>
         </w:tc>
@@ -4612,7 +4619,7 @@
                 <w:color w:val="000000"/>
                 <w:sz w:val="20"/>
               </w:rPr>
-              <w:t>{trang_thai_hd}</w:t>
+              <w:t>{trang_thai_hop_dong}</w:t>
             </w:r>
           </w:p>
         </w:tc>
@@ -4622,6 +4629,13 @@
       <w:pPr>
         <w:spacing w:before="0" w:after="100" w:line="120" w:lineRule="auto"/>
       </w:pPr>
+      <w:r>
+        <w:rPr>
+          <w:vanish/>
+          <w:sz w:val="2"/>
+        </w:rPr>
+        <w:t>{/ds_hop_dong}</w:t>
+      </w:r>
     </w:p>
     <w:p>
       <w:pPr>
@@ -4707,14 +4721,7 @@
         <w:ind w:left="540" w:hanging="271"/>
       </w:pPr>
       <w:r>
-        <w:rPr>
-          <w:rFonts w:ascii="Calibri" w:hAnsi="Calibri" w:eastAsia="Calibri"/>
-          <w:b w:val="0"/>
-          <w:i w:val="0"/>
-          <w:color w:val="000000"/>
-          <w:sz w:val="20"/>
-        </w:rPr>
-        <w:t>Phân loại hợp đồng đúng là Tư vấn hoặc Thẩm định ở từng lượt thử.</w:t>
+        <w:t>Số bảng hợp đồng và phân loại Tư vấn/Thẩm định khớp tất cả hợp đồng hiện hành liên kết với gói thầu.</w:t>
       </w:r>
     </w:p>
     <w:sectPr>

</xml_diff>

<commit_message>
feat: enhance Word integration with dictionary search and derived variable support
- Added a search input for filtering Word variables in the dictionary.
- Implemented derived variable codes for currency and date formats.
- Updated UI to improve layout and accessibility of dictionary controls.
- Removed the package full profile document from Word publication definitions.
- Adjusted tests to reflect the removal of the package full profile document.
- Added new tests for derived variable functionality and search capabilities.
</commit_message>
<xml_diff>
--- a/docs/BiddingFlow_Mau_Kiem_Thu_Xuat_Word.docx
+++ b/docs/BiddingFlow_Mau_Kiem_Thu_Xuat_Word.docx
@@ -4724,6 +4724,350 @@
         <w:t>Số bảng hợp đồng và phân loại Tư vấn/Thẩm định khớp tất cả hợp đồng hiện hành liên kết với gói thầu.</w:t>
       </w:r>
     </w:p>
+    <w:p>
+      <w:pPr>
+        <w:pStyle w:val="Heading1"/>
+        <w:pageBreakBefore/>
+      </w:pPr>
+      <w:r>
+        <w:t>6. Hướng dẫn sử dụng biến dẫn xuất</w:t>
+      </w:r>
+    </w:p>
+    <w:p>
+      <w:r>
+        <w:t>Biến dẫn xuất dùng dữ liệu của một biến gốc đã được cấu hình. Hãy thêm đúng tiền tố vào trước tên biến gốc và giữ nguyên toàn bộ phần tên phía sau.</w:t>
+      </w:r>
+    </w:p>
+    <w:p>
+      <w:pPr>
+        <w:pStyle w:val="Heading2"/>
+      </w:pPr>
+      <w:r>
+        <w:t>6.1. Quy tắc</w:t>
+      </w:r>
+    </w:p>
+    <w:p>
+      <w:pPr>
+        <w:pStyle w:val="ListBullet"/>
+      </w:pPr>
+      <w:r>
+        <w:t>Tiền bằng chữ: thêm tiền tố bangchu_. Ví dụ, từ {gia_gt} dùng {bangchu_gia_gt}. Quy tắc này chỉ áp dụng cho biến ánh xạ từ trường tiền.</w:t>
+      </w:r>
+    </w:p>
+    <w:p>
+      <w:pPr>
+        <w:pStyle w:val="ListBullet"/>
+      </w:pPr>
+      <w:r>
+        <w:t>Ngày rút gọn: thêm tiền tố S_. Ví dụ, từ {tg_dang_tai_kh} dùng {S_tg_dang_tai_kh}. Kết quả có dạng dd/MM/yyyy.</w:t>
+      </w:r>
+    </w:p>
+    <w:p>
+      <w:pPr>
+        <w:pStyle w:val="ListBullet"/>
+      </w:pPr>
+      <w:r>
+        <w:t>Ngày giờ đầy đủ: dùng trực tiếp biến gốc {tg_dang_tai_kh}; hệ thống giữ cả giờ và phút đối với trường ngày giờ.</w:t>
+      </w:r>
+    </w:p>
+    <w:p>
+      <w:pPr>
+        <w:pStyle w:val="ListBullet"/>
+      </w:pPr>
+      <w:r>
+        <w:t>Không thêm khoảng trắng trong tên biến. Biến gốc phải có trong Từ điển biến và được ánh xạ đúng kiểu dữ liệu trước khi xuất.</w:t>
+      </w:r>
+    </w:p>
+    <w:p>
+      <w:pPr>
+        <w:pStyle w:val="Heading2"/>
+      </w:pPr>
+      <w:r>
+        <w:t>6.2. Ví dụ kiểm thử ngay trên gói thầu</w:t>
+      </w:r>
+    </w:p>
+    <w:p>
+      <w:r>
+        <w:t>Bảng dưới đây vừa minh họa cú pháp trong file mẫu, vừa cho phép đối chiếu trực tiếp kết quả sau khi xuất Word.</w:t>
+      </w:r>
+    </w:p>
+    <w:tbl>
+      <w:tblPr>
+        <w:tblW w:type="dxa" w:w="9360"/>
+        <w:jc w:val="left"/>
+        <w:tblLayout w:type="fixed"/>
+        <w:tblLook w:firstColumn="1" w:firstRow="1" w:lastColumn="0" w:lastRow="0" w:noHBand="0" w:noVBand="1" w:val="04A0"/>
+        <w:tblInd w:w="120" w:type="dxa"/>
+        <w:tblBorders>
+          <w:top w:val="single" w:sz="6" w:space="0" w:color="B8C4D1"/>
+          <w:left w:val="single" w:sz="6" w:space="0" w:color="B8C4D1"/>
+          <w:bottom w:val="single" w:sz="6" w:space="0" w:color="B8C4D1"/>
+          <w:right w:val="single" w:sz="6" w:space="0" w:color="B8C4D1"/>
+          <w:insideH w:val="single" w:sz="6" w:space="0" w:color="B8C4D1"/>
+          <w:insideV w:val="single" w:sz="6" w:space="0" w:color="B8C4D1"/>
+        </w:tblBorders>
+      </w:tblPr>
+      <w:tblGrid>
+        <w:gridCol w:w="2700"/>
+        <w:gridCol w:w="6660"/>
+      </w:tblGrid>
+      <w:tr>
+        <w:trPr>
+          <w:cantSplit/>
+        </w:trPr>
+        <w:tc>
+          <w:tcPr>
+            <w:tcW w:type="dxa" w:w="2700"/>
+            <w:shd w:fill="F4F6F9"/>
+            <w:tcMar>
+              <w:top w:w="80" w:type="dxa"/>
+              <w:bottom w:w="80" w:type="dxa"/>
+              <w:start w:w="120" w:type="dxa"/>
+              <w:end w:w="120" w:type="dxa"/>
+            </w:tcMar>
+            <w:vAlign w:val="center"/>
+          </w:tcPr>
+          <w:p>
+            <w:pPr>
+              <w:pStyle w:val="TableBody"/>
+              <w:spacing w:before="0" w:after="0" w:line="259" w:lineRule="auto"/>
+              <w:jc w:val="left"/>
+            </w:pPr>
+            <w:r>
+              <w:rPr>
+                <w:rFonts w:ascii="Calibri" w:hAnsi="Calibri"/>
+                <w:b/>
+                <w:sz w:val="19"/>
+              </w:rPr>
+              <w:t>Giá trị số</w:t>
+            </w:r>
+          </w:p>
+        </w:tc>
+        <w:tc>
+          <w:tcPr>
+            <w:tcW w:type="dxa" w:w="6660"/>
+            <w:tcMar>
+              <w:top w:w="80" w:type="dxa"/>
+              <w:bottom w:w="80" w:type="dxa"/>
+              <w:start w:w="120" w:type="dxa"/>
+              <w:end w:w="120" w:type="dxa"/>
+            </w:tcMar>
+            <w:vAlign w:val="center"/>
+          </w:tcPr>
+          <w:p>
+            <w:pPr>
+              <w:pStyle w:val="TableBody"/>
+              <w:spacing w:before="0" w:after="0" w:line="259" w:lineRule="auto"/>
+              <w:jc w:val="left"/>
+            </w:pPr>
+            <w:r>
+              <w:rPr>
+                <w:rFonts w:ascii="Calibri" w:hAnsi="Calibri"/>
+                <w:b w:val="0"/>
+                <w:sz w:val="20"/>
+              </w:rPr>
+              <w:t>{gia_gt}</w:t>
+            </w:r>
+          </w:p>
+        </w:tc>
+      </w:tr>
+      <w:tr>
+        <w:trPr>
+          <w:cantSplit/>
+        </w:trPr>
+        <w:tc>
+          <w:tcPr>
+            <w:tcW w:type="dxa" w:w="2700"/>
+            <w:shd w:fill="F4F6F9"/>
+            <w:tcMar>
+              <w:top w:w="80" w:type="dxa"/>
+              <w:bottom w:w="80" w:type="dxa"/>
+              <w:start w:w="120" w:type="dxa"/>
+              <w:end w:w="120" w:type="dxa"/>
+            </w:tcMar>
+            <w:vAlign w:val="center"/>
+          </w:tcPr>
+          <w:p>
+            <w:pPr>
+              <w:pStyle w:val="TableBody"/>
+              <w:spacing w:before="0" w:after="0" w:line="259" w:lineRule="auto"/>
+              <w:jc w:val="left"/>
+            </w:pPr>
+            <w:r>
+              <w:rPr>
+                <w:rFonts w:ascii="Calibri" w:hAnsi="Calibri"/>
+                <w:b/>
+                <w:sz w:val="19"/>
+              </w:rPr>
+              <w:t>Bằng chữ</w:t>
+            </w:r>
+          </w:p>
+        </w:tc>
+        <w:tc>
+          <w:tcPr>
+            <w:tcW w:type="dxa" w:w="6660"/>
+            <w:tcMar>
+              <w:top w:w="80" w:type="dxa"/>
+              <w:bottom w:w="80" w:type="dxa"/>
+              <w:start w:w="120" w:type="dxa"/>
+              <w:end w:w="120" w:type="dxa"/>
+            </w:tcMar>
+            <w:vAlign w:val="center"/>
+          </w:tcPr>
+          <w:p>
+            <w:pPr>
+              <w:pStyle w:val="TableBody"/>
+              <w:spacing w:before="0" w:after="0" w:line="259" w:lineRule="auto"/>
+              <w:jc w:val="left"/>
+            </w:pPr>
+            <w:r>
+              <w:rPr>
+                <w:rFonts w:ascii="Calibri" w:hAnsi="Calibri"/>
+                <w:b w:val="0"/>
+                <w:sz w:val="20"/>
+              </w:rPr>
+              <w:t>{bangchu_gia_gt}</w:t>
+            </w:r>
+          </w:p>
+        </w:tc>
+      </w:tr>
+      <w:tr>
+        <w:trPr>
+          <w:cantSplit/>
+        </w:trPr>
+        <w:tc>
+          <w:tcPr>
+            <w:tcW w:type="dxa" w:w="2700"/>
+            <w:shd w:fill="F4F6F9"/>
+            <w:tcMar>
+              <w:top w:w="80" w:type="dxa"/>
+              <w:bottom w:w="80" w:type="dxa"/>
+              <w:start w:w="120" w:type="dxa"/>
+              <w:end w:w="120" w:type="dxa"/>
+            </w:tcMar>
+            <w:vAlign w:val="center"/>
+          </w:tcPr>
+          <w:p>
+            <w:pPr>
+              <w:pStyle w:val="TableBody"/>
+              <w:spacing w:before="0" w:after="0" w:line="259" w:lineRule="auto"/>
+              <w:jc w:val="left"/>
+            </w:pPr>
+            <w:r>
+              <w:rPr>
+                <w:rFonts w:ascii="Calibri" w:hAnsi="Calibri"/>
+                <w:b/>
+                <w:sz w:val="19"/>
+              </w:rPr>
+              <w:t>Ngày giờ đầy đủ</w:t>
+            </w:r>
+          </w:p>
+        </w:tc>
+        <w:tc>
+          <w:tcPr>
+            <w:tcW w:type="dxa" w:w="6660"/>
+            <w:tcMar>
+              <w:top w:w="80" w:type="dxa"/>
+              <w:bottom w:w="80" w:type="dxa"/>
+              <w:start w:w="120" w:type="dxa"/>
+              <w:end w:w="120" w:type="dxa"/>
+            </w:tcMar>
+            <w:vAlign w:val="center"/>
+          </w:tcPr>
+          <w:p>
+            <w:pPr>
+              <w:pStyle w:val="TableBody"/>
+              <w:spacing w:before="0" w:after="0" w:line="259" w:lineRule="auto"/>
+              <w:jc w:val="left"/>
+            </w:pPr>
+            <w:r>
+              <w:rPr>
+                <w:rFonts w:ascii="Calibri" w:hAnsi="Calibri"/>
+                <w:b w:val="0"/>
+                <w:sz w:val="20"/>
+              </w:rPr>
+              <w:t>{tg_dang_tai_kh}</w:t>
+            </w:r>
+          </w:p>
+        </w:tc>
+      </w:tr>
+      <w:tr>
+        <w:trPr>
+          <w:cantSplit/>
+        </w:trPr>
+        <w:tc>
+          <w:tcPr>
+            <w:tcW w:type="dxa" w:w="2700"/>
+            <w:shd w:fill="F4F6F9"/>
+            <w:tcMar>
+              <w:top w:w="80" w:type="dxa"/>
+              <w:bottom w:w="80" w:type="dxa"/>
+              <w:start w:w="120" w:type="dxa"/>
+              <w:end w:w="120" w:type="dxa"/>
+            </w:tcMar>
+            <w:vAlign w:val="center"/>
+          </w:tcPr>
+          <w:p>
+            <w:pPr>
+              <w:pStyle w:val="TableBody"/>
+              <w:spacing w:before="0" w:after="0" w:line="259" w:lineRule="auto"/>
+              <w:jc w:val="left"/>
+            </w:pPr>
+            <w:r>
+              <w:rPr>
+                <w:rFonts w:ascii="Calibri" w:hAnsi="Calibri"/>
+                <w:b/>
+                <w:sz w:val="19"/>
+              </w:rPr>
+              <w:t>Ngày rút gọn</w:t>
+            </w:r>
+          </w:p>
+        </w:tc>
+        <w:tc>
+          <w:tcPr>
+            <w:tcW w:type="dxa" w:w="6660"/>
+            <w:tcMar>
+              <w:top w:w="80" w:type="dxa"/>
+              <w:bottom w:w="80" w:type="dxa"/>
+              <w:start w:w="120" w:type="dxa"/>
+              <w:end w:w="120" w:type="dxa"/>
+            </w:tcMar>
+            <w:vAlign w:val="center"/>
+          </w:tcPr>
+          <w:p>
+            <w:pPr>
+              <w:pStyle w:val="TableBody"/>
+              <w:spacing w:before="0" w:after="0" w:line="259" w:lineRule="auto"/>
+              <w:jc w:val="left"/>
+            </w:pPr>
+            <w:r>
+              <w:rPr>
+                <w:rFonts w:ascii="Calibri" w:hAnsi="Calibri"/>
+                <w:b w:val="0"/>
+                <w:sz w:val="20"/>
+              </w:rPr>
+              <w:t>{S_tg_dang_tai_kh}</w:t>
+            </w:r>
+          </w:p>
+        </w:tc>
+      </w:tr>
+    </w:tbl>
+    <w:p>
+      <w:pPr>
+        <w:pStyle w:val="ListBullet"/>
+      </w:pPr>
+      <w:r>
+        <w:t>Kết quả kỳ vọng: 12.000.000 → Mười hai triệu đồng; 05/03/2026 14:55 → 14:55 ngày 05/3/2026; ngày rút gọn → 05/03/2026.</w:t>
+      </w:r>
+    </w:p>
+    <w:p>
+      <w:pPr>
+        <w:pStyle w:val="ListBullet"/>
+      </w:pPr>
+      <w:r>
+        <w:t>Sau khi tải mẫu lên, hãy gán rõ file cho từng chức năng xuất Word cần dùng; hệ thống không tự chọn biểu mẫu thay người quản lý.</w:t>
+      </w:r>
+    </w:p>
     <w:sectPr>
       <w:headerReference w:type="default" r:id="rId9"/>
       <w:footerReference w:type="default" r:id="rId10"/>

</xml_diff>

<commit_message>
feat: enhance date formatting and derived variable handling in document generation
</commit_message>
<xml_diff>
--- a/docs/BiddingFlow_Mau_Kiem_Thu_Xuat_Word.docx
+++ b/docs/BiddingFlow_Mau_Kiem_Thu_Xuat_Word.docx
@@ -729,9 +729,7 @@
       <w:pPr>
         <w:spacing w:after="0"/>
       </w:pPr>
-      <w:r>
-        <w:br w:type="page"/>
-      </w:r>
+      <w:r/>
     </w:p>
     <w:p>
       <w:pPr>
@@ -1863,9 +1861,7 @@
       <w:pPr>
         <w:spacing w:after="0"/>
       </w:pPr>
-      <w:r>
-        <w:br w:type="page"/>
-      </w:r>
+      <w:r/>
     </w:p>
     <w:p>
       <w:pPr>
@@ -2971,9 +2967,7 @@
       <w:pPr>
         <w:spacing w:after="0"/>
       </w:pPr>
-      <w:r>
-        <w:br w:type="page"/>
-      </w:r>
+      <w:r/>
     </w:p>
     <w:p>
       <w:pPr>
@@ -3986,9 +3980,7 @@
       <w:pPr>
         <w:spacing w:after="0"/>
       </w:pPr>
-      <w:r>
-        <w:br w:type="page"/>
-      </w:r>
+      <w:r/>
     </w:p>
     <w:p>
       <w:pPr>
@@ -4759,7 +4751,7 @@
         <w:pStyle w:val="ListBullet"/>
       </w:pPr>
       <w:r>
-        <w:t>Ngày rút gọn: thêm tiền tố S_. Ví dụ, từ {tg_dang_tai_kh} dùng {S_tg_dang_tai_kh}. Kết quả có dạng dd/MM/yyyy.</w:t>
+        <w:t>Ngày rút gọn: thêm tiền tố S_. Ví dụ, từ {tg_dang_tai_kh} dùng {S_tg_dang_tai_kh}. Kết quả: ngày dưới 10 có số 0; tháng chỉ có số 0 phía trước với tháng 1 và tháng 2 (ví dụ 05/3/2026, 05/01/2026).</w:t>
       </w:r>
     </w:p>
     <w:p>
@@ -5057,7 +5049,7 @@
         <w:pStyle w:val="ListBullet"/>
       </w:pPr>
       <w:r>
-        <w:t>Kết quả kỳ vọng: 12.000.000 → Mười hai triệu đồng; 05/03/2026 14:55 → 14:55 ngày 05/3/2026; ngày rút gọn → 05/03/2026.</w:t>
+        <w:t>Kết quả kỳ vọng: 12.000.000 → Mười hai triệu đồng; 05/03/2026 14:55 → 14:55 ngày 05/3/2026; ngày rút gọn → 05/3/2026.</w:t>
       </w:r>
     </w:p>
     <w:p>

</xml_diff>